<commit_message>
Add Status column to Test Plan - all Iteration 2 test cases passed
Co-Authored-By: Claude Sonnet 5 <noreply@anthropic.com>
</commit_message>
<xml_diff>
--- a/docs/test-plan/Test_Plan_TreasureRow.docx
+++ b/docs/test-plan/Test_Plan_TreasureRow.docx
@@ -234,15 +234,16 @@
         <w:tblLook w:firstColumn="1" w:firstRow="1" w:lastColumn="0" w:lastRow="0" w:noHBand="0" w:noVBand="1" w:val="04A0"/>
       </w:tblPr>
       <w:tblGrid>
-        <w:gridCol w:w="2160"/>
-        <w:gridCol w:w="2160"/>
-        <w:gridCol w:w="2160"/>
-        <w:gridCol w:w="2160"/>
+        <w:gridCol w:w="1728"/>
+        <w:gridCol w:w="1728"/>
+        <w:gridCol w:w="1728"/>
+        <w:gridCol w:w="1728"/>
+        <w:gridCol w:w="1728"/>
       </w:tblGrid>
       <w:tr>
         <w:tc>
           <w:tcPr>
-            <w:tcW w:type="dxa" w:w="864"/>
+            <w:tcW w:type="dxa" w:w="720"/>
             <w:shd w:val="clear" w:fill="D9E2F3"/>
           </w:tcPr>
           <w:p>
@@ -256,7 +257,7 @@
         </w:tc>
         <w:tc>
           <w:tcPr>
-            <w:tcW w:type="dxa" w:w="1728"/>
+            <w:tcW w:type="dxa" w:w="1440"/>
             <w:shd w:val="clear" w:fill="D9E2F3"/>
           </w:tcPr>
           <w:p>
@@ -270,7 +271,7 @@
         </w:tc>
         <w:tc>
           <w:tcPr>
-            <w:tcW w:type="dxa" w:w="3744"/>
+            <w:tcW w:type="dxa" w:w="3312"/>
             <w:shd w:val="clear" w:fill="D9E2F3"/>
           </w:tcPr>
           <w:p>
@@ -284,7 +285,7 @@
         </w:tc>
         <w:tc>
           <w:tcPr>
-            <w:tcW w:type="dxa" w:w="3168"/>
+            <w:tcW w:type="dxa" w:w="2880"/>
             <w:shd w:val="clear" w:fill="D9E2F3"/>
           </w:tcPr>
           <w:p>
@@ -296,11 +297,25 @@
             </w:r>
           </w:p>
         </w:tc>
+        <w:tc>
+          <w:tcPr>
+            <w:tcW w:type="dxa" w:w="1008"/>
+            <w:shd w:val="clear" w:fill="D9E2F3"/>
+          </w:tcPr>
+          <w:p>
+            <w:r>
+              <w:rPr>
+                <w:b/>
+              </w:rPr>
+              <w:t>Status</w:t>
+            </w:r>
+          </w:p>
+        </w:tc>
       </w:tr>
       <w:tr>
         <w:tc>
           <w:tcPr>
-            <w:tcW w:type="dxa" w:w="864"/>
+            <w:tcW w:type="dxa" w:w="720"/>
           </w:tcPr>
           <w:p>
             <w:r>
@@ -310,7 +325,7 @@
         </w:tc>
         <w:tc>
           <w:tcPr>
-            <w:tcW w:type="dxa" w:w="1728"/>
+            <w:tcW w:type="dxa" w:w="1440"/>
           </w:tcPr>
           <w:p>
             <w:r>
@@ -320,7 +335,7 @@
         </w:tc>
         <w:tc>
           <w:tcPr>
-            <w:tcW w:type="dxa" w:w="3744"/>
+            <w:tcW w:type="dxa" w:w="3312"/>
           </w:tcPr>
           <w:p>
             <w:r>
@@ -330,7 +345,7 @@
         </w:tc>
         <w:tc>
           <w:tcPr>
-            <w:tcW w:type="dxa" w:w="3168"/>
+            <w:tcW w:type="dxa" w:w="2880"/>
           </w:tcPr>
           <w:p>
             <w:r>
@@ -338,11 +353,21 @@
             </w:r>
           </w:p>
         </w:tc>
+        <w:tc>
+          <w:tcPr>
+            <w:tcW w:type="dxa" w:w="1008"/>
+          </w:tcPr>
+          <w:p>
+            <w:r>
+              <w:t>Pass</w:t>
+            </w:r>
+          </w:p>
+        </w:tc>
       </w:tr>
       <w:tr>
         <w:tc>
           <w:tcPr>
-            <w:tcW w:type="dxa" w:w="864"/>
+            <w:tcW w:type="dxa" w:w="720"/>
           </w:tcPr>
           <w:p>
             <w:r>
@@ -352,7 +377,7 @@
         </w:tc>
         <w:tc>
           <w:tcPr>
-            <w:tcW w:type="dxa" w:w="1728"/>
+            <w:tcW w:type="dxa" w:w="1440"/>
           </w:tcPr>
           <w:p>
             <w:r>
@@ -362,7 +387,7 @@
         </w:tc>
         <w:tc>
           <w:tcPr>
-            <w:tcW w:type="dxa" w:w="3744"/>
+            <w:tcW w:type="dxa" w:w="3312"/>
           </w:tcPr>
           <w:p>
             <w:r>
@@ -372,7 +397,7 @@
         </w:tc>
         <w:tc>
           <w:tcPr>
-            <w:tcW w:type="dxa" w:w="3168"/>
+            <w:tcW w:type="dxa" w:w="2880"/>
           </w:tcPr>
           <w:p>
             <w:r>
@@ -380,11 +405,21 @@
             </w:r>
           </w:p>
         </w:tc>
+        <w:tc>
+          <w:tcPr>
+            <w:tcW w:type="dxa" w:w="1008"/>
+          </w:tcPr>
+          <w:p>
+            <w:r>
+              <w:t>Pass</w:t>
+            </w:r>
+          </w:p>
+        </w:tc>
       </w:tr>
       <w:tr>
         <w:tc>
           <w:tcPr>
-            <w:tcW w:type="dxa" w:w="864"/>
+            <w:tcW w:type="dxa" w:w="720"/>
           </w:tcPr>
           <w:p>
             <w:r>
@@ -394,7 +429,7 @@
         </w:tc>
         <w:tc>
           <w:tcPr>
-            <w:tcW w:type="dxa" w:w="1728"/>
+            <w:tcW w:type="dxa" w:w="1440"/>
           </w:tcPr>
           <w:p>
             <w:r>
@@ -404,7 +439,7 @@
         </w:tc>
         <w:tc>
           <w:tcPr>
-            <w:tcW w:type="dxa" w:w="3744"/>
+            <w:tcW w:type="dxa" w:w="3312"/>
           </w:tcPr>
           <w:p>
             <w:r>
@@ -414,7 +449,7 @@
         </w:tc>
         <w:tc>
           <w:tcPr>
-            <w:tcW w:type="dxa" w:w="3168"/>
+            <w:tcW w:type="dxa" w:w="2880"/>
           </w:tcPr>
           <w:p>
             <w:r>
@@ -422,11 +457,21 @@
             </w:r>
           </w:p>
         </w:tc>
+        <w:tc>
+          <w:tcPr>
+            <w:tcW w:type="dxa" w:w="1008"/>
+          </w:tcPr>
+          <w:p>
+            <w:r>
+              <w:t>Pass</w:t>
+            </w:r>
+          </w:p>
+        </w:tc>
       </w:tr>
       <w:tr>
         <w:tc>
           <w:tcPr>
-            <w:tcW w:type="dxa" w:w="864"/>
+            <w:tcW w:type="dxa" w:w="720"/>
           </w:tcPr>
           <w:p>
             <w:r>
@@ -436,7 +481,7 @@
         </w:tc>
         <w:tc>
           <w:tcPr>
-            <w:tcW w:type="dxa" w:w="1728"/>
+            <w:tcW w:type="dxa" w:w="1440"/>
           </w:tcPr>
           <w:p>
             <w:r>
@@ -446,7 +491,7 @@
         </w:tc>
         <w:tc>
           <w:tcPr>
-            <w:tcW w:type="dxa" w:w="3744"/>
+            <w:tcW w:type="dxa" w:w="3312"/>
           </w:tcPr>
           <w:p>
             <w:r>
@@ -456,7 +501,7 @@
         </w:tc>
         <w:tc>
           <w:tcPr>
-            <w:tcW w:type="dxa" w:w="3168"/>
+            <w:tcW w:type="dxa" w:w="2880"/>
           </w:tcPr>
           <w:p>
             <w:r>
@@ -464,11 +509,21 @@
             </w:r>
           </w:p>
         </w:tc>
+        <w:tc>
+          <w:tcPr>
+            <w:tcW w:type="dxa" w:w="1008"/>
+          </w:tcPr>
+          <w:p>
+            <w:r>
+              <w:t>Pass</w:t>
+            </w:r>
+          </w:p>
+        </w:tc>
       </w:tr>
       <w:tr>
         <w:tc>
           <w:tcPr>
-            <w:tcW w:type="dxa" w:w="864"/>
+            <w:tcW w:type="dxa" w:w="720"/>
           </w:tcPr>
           <w:p>
             <w:r>
@@ -478,7 +533,7 @@
         </w:tc>
         <w:tc>
           <w:tcPr>
-            <w:tcW w:type="dxa" w:w="1728"/>
+            <w:tcW w:type="dxa" w:w="1440"/>
           </w:tcPr>
           <w:p>
             <w:r>
@@ -488,7 +543,7 @@
         </w:tc>
         <w:tc>
           <w:tcPr>
-            <w:tcW w:type="dxa" w:w="3744"/>
+            <w:tcW w:type="dxa" w:w="3312"/>
           </w:tcPr>
           <w:p>
             <w:r>
@@ -498,7 +553,7 @@
         </w:tc>
         <w:tc>
           <w:tcPr>
-            <w:tcW w:type="dxa" w:w="3168"/>
+            <w:tcW w:type="dxa" w:w="2880"/>
           </w:tcPr>
           <w:p>
             <w:r>
@@ -506,11 +561,21 @@
             </w:r>
           </w:p>
         </w:tc>
+        <w:tc>
+          <w:tcPr>
+            <w:tcW w:type="dxa" w:w="1008"/>
+          </w:tcPr>
+          <w:p>
+            <w:r>
+              <w:t>Pass</w:t>
+            </w:r>
+          </w:p>
+        </w:tc>
       </w:tr>
       <w:tr>
         <w:tc>
           <w:tcPr>
-            <w:tcW w:type="dxa" w:w="864"/>
+            <w:tcW w:type="dxa" w:w="720"/>
           </w:tcPr>
           <w:p>
             <w:r>
@@ -520,7 +585,7 @@
         </w:tc>
         <w:tc>
           <w:tcPr>
-            <w:tcW w:type="dxa" w:w="1728"/>
+            <w:tcW w:type="dxa" w:w="1440"/>
           </w:tcPr>
           <w:p>
             <w:r>
@@ -530,7 +595,7 @@
         </w:tc>
         <w:tc>
           <w:tcPr>
-            <w:tcW w:type="dxa" w:w="3744"/>
+            <w:tcW w:type="dxa" w:w="3312"/>
           </w:tcPr>
           <w:p>
             <w:r>
@@ -540,7 +605,7 @@
         </w:tc>
         <w:tc>
           <w:tcPr>
-            <w:tcW w:type="dxa" w:w="3168"/>
+            <w:tcW w:type="dxa" w:w="2880"/>
           </w:tcPr>
           <w:p>
             <w:r>
@@ -548,11 +613,21 @@
             </w:r>
           </w:p>
         </w:tc>
+        <w:tc>
+          <w:tcPr>
+            <w:tcW w:type="dxa" w:w="1008"/>
+          </w:tcPr>
+          <w:p>
+            <w:r>
+              <w:t>Pass</w:t>
+            </w:r>
+          </w:p>
+        </w:tc>
       </w:tr>
       <w:tr>
         <w:tc>
           <w:tcPr>
-            <w:tcW w:type="dxa" w:w="864"/>
+            <w:tcW w:type="dxa" w:w="720"/>
           </w:tcPr>
           <w:p>
             <w:r>
@@ -562,7 +637,7 @@
         </w:tc>
         <w:tc>
           <w:tcPr>
-            <w:tcW w:type="dxa" w:w="1728"/>
+            <w:tcW w:type="dxa" w:w="1440"/>
           </w:tcPr>
           <w:p>
             <w:r>
@@ -572,7 +647,7 @@
         </w:tc>
         <w:tc>
           <w:tcPr>
-            <w:tcW w:type="dxa" w:w="3744"/>
+            <w:tcW w:type="dxa" w:w="3312"/>
           </w:tcPr>
           <w:p>
             <w:r>
@@ -582,7 +657,7 @@
         </w:tc>
         <w:tc>
           <w:tcPr>
-            <w:tcW w:type="dxa" w:w="3168"/>
+            <w:tcW w:type="dxa" w:w="2880"/>
           </w:tcPr>
           <w:p>
             <w:r>
@@ -590,11 +665,21 @@
             </w:r>
           </w:p>
         </w:tc>
+        <w:tc>
+          <w:tcPr>
+            <w:tcW w:type="dxa" w:w="1008"/>
+          </w:tcPr>
+          <w:p>
+            <w:r>
+              <w:t>Pass</w:t>
+            </w:r>
+          </w:p>
+        </w:tc>
       </w:tr>
       <w:tr>
         <w:tc>
           <w:tcPr>
-            <w:tcW w:type="dxa" w:w="864"/>
+            <w:tcW w:type="dxa" w:w="720"/>
           </w:tcPr>
           <w:p>
             <w:r>
@@ -604,7 +689,7 @@
         </w:tc>
         <w:tc>
           <w:tcPr>
-            <w:tcW w:type="dxa" w:w="1728"/>
+            <w:tcW w:type="dxa" w:w="1440"/>
           </w:tcPr>
           <w:p>
             <w:r>
@@ -614,7 +699,7 @@
         </w:tc>
         <w:tc>
           <w:tcPr>
-            <w:tcW w:type="dxa" w:w="3744"/>
+            <w:tcW w:type="dxa" w:w="3312"/>
           </w:tcPr>
           <w:p>
             <w:r>
@@ -624,7 +709,7 @@
         </w:tc>
         <w:tc>
           <w:tcPr>
-            <w:tcW w:type="dxa" w:w="3168"/>
+            <w:tcW w:type="dxa" w:w="2880"/>
           </w:tcPr>
           <w:p>
             <w:r>
@@ -632,11 +717,21 @@
             </w:r>
           </w:p>
         </w:tc>
+        <w:tc>
+          <w:tcPr>
+            <w:tcW w:type="dxa" w:w="1008"/>
+          </w:tcPr>
+          <w:p>
+            <w:r>
+              <w:t>Pass</w:t>
+            </w:r>
+          </w:p>
+        </w:tc>
       </w:tr>
       <w:tr>
         <w:tc>
           <w:tcPr>
-            <w:tcW w:type="dxa" w:w="864"/>
+            <w:tcW w:type="dxa" w:w="720"/>
           </w:tcPr>
           <w:p>
             <w:r>
@@ -646,7 +741,7 @@
         </w:tc>
         <w:tc>
           <w:tcPr>
-            <w:tcW w:type="dxa" w:w="1728"/>
+            <w:tcW w:type="dxa" w:w="1440"/>
           </w:tcPr>
           <w:p>
             <w:r>
@@ -656,7 +751,7 @@
         </w:tc>
         <w:tc>
           <w:tcPr>
-            <w:tcW w:type="dxa" w:w="3744"/>
+            <w:tcW w:type="dxa" w:w="3312"/>
           </w:tcPr>
           <w:p>
             <w:r>
@@ -666,7 +761,7 @@
         </w:tc>
         <w:tc>
           <w:tcPr>
-            <w:tcW w:type="dxa" w:w="3168"/>
+            <w:tcW w:type="dxa" w:w="2880"/>
           </w:tcPr>
           <w:p>
             <w:r>
@@ -674,11 +769,21 @@
             </w:r>
           </w:p>
         </w:tc>
+        <w:tc>
+          <w:tcPr>
+            <w:tcW w:type="dxa" w:w="1008"/>
+          </w:tcPr>
+          <w:p>
+            <w:r>
+              <w:t>Pass</w:t>
+            </w:r>
+          </w:p>
+        </w:tc>
       </w:tr>
       <w:tr>
         <w:tc>
           <w:tcPr>
-            <w:tcW w:type="dxa" w:w="864"/>
+            <w:tcW w:type="dxa" w:w="720"/>
           </w:tcPr>
           <w:p>
             <w:r>
@@ -688,7 +793,7 @@
         </w:tc>
         <w:tc>
           <w:tcPr>
-            <w:tcW w:type="dxa" w:w="1728"/>
+            <w:tcW w:type="dxa" w:w="1440"/>
           </w:tcPr>
           <w:p>
             <w:r>
@@ -698,7 +803,7 @@
         </w:tc>
         <w:tc>
           <w:tcPr>
-            <w:tcW w:type="dxa" w:w="3744"/>
+            <w:tcW w:type="dxa" w:w="3312"/>
           </w:tcPr>
           <w:p>
             <w:r>
@@ -708,7 +813,7 @@
         </w:tc>
         <w:tc>
           <w:tcPr>
-            <w:tcW w:type="dxa" w:w="3168"/>
+            <w:tcW w:type="dxa" w:w="2880"/>
           </w:tcPr>
           <w:p>
             <w:r>
@@ -716,11 +821,21 @@
             </w:r>
           </w:p>
         </w:tc>
+        <w:tc>
+          <w:tcPr>
+            <w:tcW w:type="dxa" w:w="1008"/>
+          </w:tcPr>
+          <w:p>
+            <w:r>
+              <w:t>Pass</w:t>
+            </w:r>
+          </w:p>
+        </w:tc>
       </w:tr>
       <w:tr>
         <w:tc>
           <w:tcPr>
-            <w:tcW w:type="dxa" w:w="864"/>
+            <w:tcW w:type="dxa" w:w="720"/>
           </w:tcPr>
           <w:p>
             <w:r>
@@ -730,7 +845,7 @@
         </w:tc>
         <w:tc>
           <w:tcPr>
-            <w:tcW w:type="dxa" w:w="1728"/>
+            <w:tcW w:type="dxa" w:w="1440"/>
           </w:tcPr>
           <w:p>
             <w:r>
@@ -740,7 +855,7 @@
         </w:tc>
         <w:tc>
           <w:tcPr>
-            <w:tcW w:type="dxa" w:w="3744"/>
+            <w:tcW w:type="dxa" w:w="3312"/>
           </w:tcPr>
           <w:p>
             <w:r>
@@ -750,11 +865,21 @@
         </w:tc>
         <w:tc>
           <w:tcPr>
-            <w:tcW w:type="dxa" w:w="3168"/>
+            <w:tcW w:type="dxa" w:w="2880"/>
           </w:tcPr>
           <w:p>
             <w:r>
               <w:t>Saved with pending status</w:t>
+            </w:r>
+          </w:p>
+        </w:tc>
+        <w:tc>
+          <w:tcPr>
+            <w:tcW w:type="dxa" w:w="1008"/>
+          </w:tcPr>
+          <w:p>
+            <w:r>
+              <w:t>Pass</w:t>
             </w:r>
           </w:p>
         </w:tc>
@@ -783,15 +908,16 @@
         <w:tblLook w:firstColumn="1" w:firstRow="1" w:lastColumn="0" w:lastRow="0" w:noHBand="0" w:noVBand="1" w:val="04A0"/>
       </w:tblPr>
       <w:tblGrid>
-        <w:gridCol w:w="2160"/>
-        <w:gridCol w:w="2160"/>
-        <w:gridCol w:w="2160"/>
-        <w:gridCol w:w="2160"/>
+        <w:gridCol w:w="1728"/>
+        <w:gridCol w:w="1728"/>
+        <w:gridCol w:w="1728"/>
+        <w:gridCol w:w="1728"/>
+        <w:gridCol w:w="1728"/>
       </w:tblGrid>
       <w:tr>
         <w:tc>
           <w:tcPr>
-            <w:tcW w:type="dxa" w:w="864"/>
+            <w:tcW w:type="dxa" w:w="720"/>
             <w:shd w:val="clear" w:fill="D9E2F3"/>
           </w:tcPr>
           <w:p>
@@ -805,7 +931,7 @@
         </w:tc>
         <w:tc>
           <w:tcPr>
-            <w:tcW w:type="dxa" w:w="2016"/>
+            <w:tcW w:type="dxa" w:w="1584"/>
             <w:shd w:val="clear" w:fill="D9E2F3"/>
           </w:tcPr>
           <w:p>
@@ -819,7 +945,7 @@
         </w:tc>
         <w:tc>
           <w:tcPr>
-            <w:tcW w:type="dxa" w:w="3744"/>
+            <w:tcW w:type="dxa" w:w="3312"/>
             <w:shd w:val="clear" w:fill="D9E2F3"/>
           </w:tcPr>
           <w:p>
@@ -833,7 +959,7 @@
         </w:tc>
         <w:tc>
           <w:tcPr>
-            <w:tcW w:type="dxa" w:w="2880"/>
+            <w:tcW w:type="dxa" w:w="2592"/>
             <w:shd w:val="clear" w:fill="D9E2F3"/>
           </w:tcPr>
           <w:p>
@@ -845,11 +971,25 @@
             </w:r>
           </w:p>
         </w:tc>
+        <w:tc>
+          <w:tcPr>
+            <w:tcW w:type="dxa" w:w="1008"/>
+            <w:shd w:val="clear" w:fill="D9E2F3"/>
+          </w:tcPr>
+          <w:p>
+            <w:r>
+              <w:rPr>
+                <w:b/>
+              </w:rPr>
+              <w:t>Status</w:t>
+            </w:r>
+          </w:p>
+        </w:tc>
       </w:tr>
       <w:tr>
         <w:tc>
           <w:tcPr>
-            <w:tcW w:type="dxa" w:w="864"/>
+            <w:tcW w:type="dxa" w:w="720"/>
           </w:tcPr>
           <w:p>
             <w:r>
@@ -859,7 +999,7 @@
         </w:tc>
         <w:tc>
           <w:tcPr>
-            <w:tcW w:type="dxa" w:w="2016"/>
+            <w:tcW w:type="dxa" w:w="1584"/>
           </w:tcPr>
           <w:p>
             <w:r>
@@ -869,7 +1009,7 @@
         </w:tc>
         <w:tc>
           <w:tcPr>
-            <w:tcW w:type="dxa" w:w="3744"/>
+            <w:tcW w:type="dxa" w:w="3312"/>
           </w:tcPr>
           <w:p>
             <w:r>
@@ -879,7 +1019,7 @@
         </w:tc>
         <w:tc>
           <w:tcPr>
-            <w:tcW w:type="dxa" w:w="2880"/>
+            <w:tcW w:type="dxa" w:w="2592"/>
           </w:tcPr>
           <w:p>
             <w:r>
@@ -887,11 +1027,21 @@
             </w:r>
           </w:p>
         </w:tc>
+        <w:tc>
+          <w:tcPr>
+            <w:tcW w:type="dxa" w:w="1008"/>
+          </w:tcPr>
+          <w:p>
+            <w:r>
+              <w:t>Pass</w:t>
+            </w:r>
+          </w:p>
+        </w:tc>
       </w:tr>
       <w:tr>
         <w:tc>
           <w:tcPr>
-            <w:tcW w:type="dxa" w:w="864"/>
+            <w:tcW w:type="dxa" w:w="720"/>
           </w:tcPr>
           <w:p>
             <w:r>
@@ -901,7 +1051,7 @@
         </w:tc>
         <w:tc>
           <w:tcPr>
-            <w:tcW w:type="dxa" w:w="2016"/>
+            <w:tcW w:type="dxa" w:w="1584"/>
           </w:tcPr>
           <w:p>
             <w:r>
@@ -911,7 +1061,7 @@
         </w:tc>
         <w:tc>
           <w:tcPr>
-            <w:tcW w:type="dxa" w:w="3744"/>
+            <w:tcW w:type="dxa" w:w="3312"/>
           </w:tcPr>
           <w:p>
             <w:r>
@@ -921,7 +1071,7 @@
         </w:tc>
         <w:tc>
           <w:tcPr>
-            <w:tcW w:type="dxa" w:w="2880"/>
+            <w:tcW w:type="dxa" w:w="2592"/>
           </w:tcPr>
           <w:p>
             <w:r>
@@ -929,11 +1079,21 @@
             </w:r>
           </w:p>
         </w:tc>
+        <w:tc>
+          <w:tcPr>
+            <w:tcW w:type="dxa" w:w="1008"/>
+          </w:tcPr>
+          <w:p>
+            <w:r>
+              <w:t>Pass</w:t>
+            </w:r>
+          </w:p>
+        </w:tc>
       </w:tr>
       <w:tr>
         <w:tc>
           <w:tcPr>
-            <w:tcW w:type="dxa" w:w="864"/>
+            <w:tcW w:type="dxa" w:w="720"/>
           </w:tcPr>
           <w:p>
             <w:r>
@@ -943,7 +1103,7 @@
         </w:tc>
         <w:tc>
           <w:tcPr>
-            <w:tcW w:type="dxa" w:w="2016"/>
+            <w:tcW w:type="dxa" w:w="1584"/>
           </w:tcPr>
           <w:p>
             <w:r>
@@ -953,7 +1113,7 @@
         </w:tc>
         <w:tc>
           <w:tcPr>
-            <w:tcW w:type="dxa" w:w="3744"/>
+            <w:tcW w:type="dxa" w:w="3312"/>
           </w:tcPr>
           <w:p>
             <w:r>
@@ -963,7 +1123,7 @@
         </w:tc>
         <w:tc>
           <w:tcPr>
-            <w:tcW w:type="dxa" w:w="2880"/>
+            <w:tcW w:type="dxa" w:w="2592"/>
           </w:tcPr>
           <w:p>
             <w:r>
@@ -971,11 +1131,21 @@
             </w:r>
           </w:p>
         </w:tc>
+        <w:tc>
+          <w:tcPr>
+            <w:tcW w:type="dxa" w:w="1008"/>
+          </w:tcPr>
+          <w:p>
+            <w:r>
+              <w:t>Pass</w:t>
+            </w:r>
+          </w:p>
+        </w:tc>
       </w:tr>
       <w:tr>
         <w:tc>
           <w:tcPr>
-            <w:tcW w:type="dxa" w:w="864"/>
+            <w:tcW w:type="dxa" w:w="720"/>
           </w:tcPr>
           <w:p>
             <w:r>
@@ -985,7 +1155,7 @@
         </w:tc>
         <w:tc>
           <w:tcPr>
-            <w:tcW w:type="dxa" w:w="2016"/>
+            <w:tcW w:type="dxa" w:w="1584"/>
           </w:tcPr>
           <w:p>
             <w:r>
@@ -995,7 +1165,7 @@
         </w:tc>
         <w:tc>
           <w:tcPr>
-            <w:tcW w:type="dxa" w:w="3744"/>
+            <w:tcW w:type="dxa" w:w="3312"/>
           </w:tcPr>
           <w:p>
             <w:r>
@@ -1005,7 +1175,7 @@
         </w:tc>
         <w:tc>
           <w:tcPr>
-            <w:tcW w:type="dxa" w:w="2880"/>
+            <w:tcW w:type="dxa" w:w="2592"/>
           </w:tcPr>
           <w:p>
             <w:r>
@@ -1013,11 +1183,21 @@
             </w:r>
           </w:p>
         </w:tc>
+        <w:tc>
+          <w:tcPr>
+            <w:tcW w:type="dxa" w:w="1008"/>
+          </w:tcPr>
+          <w:p>
+            <w:r>
+              <w:t>Pass</w:t>
+            </w:r>
+          </w:p>
+        </w:tc>
       </w:tr>
       <w:tr>
         <w:tc>
           <w:tcPr>
-            <w:tcW w:type="dxa" w:w="864"/>
+            <w:tcW w:type="dxa" w:w="720"/>
           </w:tcPr>
           <w:p>
             <w:r>
@@ -1027,7 +1207,7 @@
         </w:tc>
         <w:tc>
           <w:tcPr>
-            <w:tcW w:type="dxa" w:w="2016"/>
+            <w:tcW w:type="dxa" w:w="1584"/>
           </w:tcPr>
           <w:p>
             <w:r>
@@ -1037,7 +1217,7 @@
         </w:tc>
         <w:tc>
           <w:tcPr>
-            <w:tcW w:type="dxa" w:w="3744"/>
+            <w:tcW w:type="dxa" w:w="3312"/>
           </w:tcPr>
           <w:p>
             <w:r>
@@ -1047,7 +1227,7 @@
         </w:tc>
         <w:tc>
           <w:tcPr>
-            <w:tcW w:type="dxa" w:w="2880"/>
+            <w:tcW w:type="dxa" w:w="2592"/>
           </w:tcPr>
           <w:p>
             <w:r>
@@ -1055,11 +1235,21 @@
             </w:r>
           </w:p>
         </w:tc>
+        <w:tc>
+          <w:tcPr>
+            <w:tcW w:type="dxa" w:w="1008"/>
+          </w:tcPr>
+          <w:p>
+            <w:r>
+              <w:t>Pass</w:t>
+            </w:r>
+          </w:p>
+        </w:tc>
       </w:tr>
       <w:tr>
         <w:tc>
           <w:tcPr>
-            <w:tcW w:type="dxa" w:w="864"/>
+            <w:tcW w:type="dxa" w:w="720"/>
           </w:tcPr>
           <w:p>
             <w:r>
@@ -1069,7 +1259,7 @@
         </w:tc>
         <w:tc>
           <w:tcPr>
-            <w:tcW w:type="dxa" w:w="2016"/>
+            <w:tcW w:type="dxa" w:w="1584"/>
           </w:tcPr>
           <w:p>
             <w:r>
@@ -1079,7 +1269,7 @@
         </w:tc>
         <w:tc>
           <w:tcPr>
-            <w:tcW w:type="dxa" w:w="3744"/>
+            <w:tcW w:type="dxa" w:w="3312"/>
           </w:tcPr>
           <w:p>
             <w:r>
@@ -1089,7 +1279,7 @@
         </w:tc>
         <w:tc>
           <w:tcPr>
-            <w:tcW w:type="dxa" w:w="2880"/>
+            <w:tcW w:type="dxa" w:w="2592"/>
           </w:tcPr>
           <w:p>
             <w:r>
@@ -1097,11 +1287,21 @@
             </w:r>
           </w:p>
         </w:tc>
+        <w:tc>
+          <w:tcPr>
+            <w:tcW w:type="dxa" w:w="1008"/>
+          </w:tcPr>
+          <w:p>
+            <w:r>
+              <w:t>Pass</w:t>
+            </w:r>
+          </w:p>
+        </w:tc>
       </w:tr>
       <w:tr>
         <w:tc>
           <w:tcPr>
-            <w:tcW w:type="dxa" w:w="864"/>
+            <w:tcW w:type="dxa" w:w="720"/>
           </w:tcPr>
           <w:p>
             <w:r>
@@ -1111,7 +1311,7 @@
         </w:tc>
         <w:tc>
           <w:tcPr>
-            <w:tcW w:type="dxa" w:w="2016"/>
+            <w:tcW w:type="dxa" w:w="1584"/>
           </w:tcPr>
           <w:p>
             <w:r>
@@ -1121,7 +1321,7 @@
         </w:tc>
         <w:tc>
           <w:tcPr>
-            <w:tcW w:type="dxa" w:w="3744"/>
+            <w:tcW w:type="dxa" w:w="3312"/>
           </w:tcPr>
           <w:p>
             <w:r>
@@ -1131,7 +1331,7 @@
         </w:tc>
         <w:tc>
           <w:tcPr>
-            <w:tcW w:type="dxa" w:w="2880"/>
+            <w:tcW w:type="dxa" w:w="2592"/>
           </w:tcPr>
           <w:p>
             <w:r>
@@ -1139,11 +1339,21 @@
             </w:r>
           </w:p>
         </w:tc>
+        <w:tc>
+          <w:tcPr>
+            <w:tcW w:type="dxa" w:w="1008"/>
+          </w:tcPr>
+          <w:p>
+            <w:r>
+              <w:t>Pass</w:t>
+            </w:r>
+          </w:p>
+        </w:tc>
       </w:tr>
       <w:tr>
         <w:tc>
           <w:tcPr>
-            <w:tcW w:type="dxa" w:w="864"/>
+            <w:tcW w:type="dxa" w:w="720"/>
           </w:tcPr>
           <w:p>
             <w:r>
@@ -1153,7 +1363,7 @@
         </w:tc>
         <w:tc>
           <w:tcPr>
-            <w:tcW w:type="dxa" w:w="2016"/>
+            <w:tcW w:type="dxa" w:w="1584"/>
           </w:tcPr>
           <w:p>
             <w:r>
@@ -1163,7 +1373,7 @@
         </w:tc>
         <w:tc>
           <w:tcPr>
-            <w:tcW w:type="dxa" w:w="3744"/>
+            <w:tcW w:type="dxa" w:w="3312"/>
           </w:tcPr>
           <w:p>
             <w:r>
@@ -1173,11 +1383,21 @@
         </w:tc>
         <w:tc>
           <w:tcPr>
-            <w:tcW w:type="dxa" w:w="2880"/>
+            <w:tcW w:type="dxa" w:w="2592"/>
           </w:tcPr>
           <w:p>
             <w:r>
               <w:t>No real credentials committed in plaintext</w:t>
+            </w:r>
+          </w:p>
+        </w:tc>
+        <w:tc>
+          <w:tcPr>
+            <w:tcW w:type="dxa" w:w="1008"/>
+          </w:tcPr>
+          <w:p>
+            <w:r>
+              <w:t>Pass</w:t>
             </w:r>
           </w:p>
         </w:tc>

</xml_diff>

<commit_message>
Update Test Plan and Project Plan to match the code (Iteration 3)
Test Plan
- Retitled for Iteration 3; corrected TC-12/TC-13 (the Iteration 2 ownership
  fix was browser-only) and re-verified TC-14 on S3
- Added TC-20 to TC-33 for the Iteration 3 fixes and a section on the
  automated test suite (74 passing)

Project Plan
- Marked completed fixes, added status to each known issue, and listed the
  security issues found and fixed in Iteration 3
- Corrected the ownership-bug risk (the claimed 19 regression tests did not
  exist; 13 automated tests now cover it) and added a web-security risk
- Added the test suite to Tools and QA; updated Iteration 3 timeline status

Co-Authored-By: Claude Opus 5.5 <noreply@anthropic.com>
</commit_message>
<xml_diff>
--- a/docs/test-plan/Test_Plan_TreasureRow.docx
+++ b/docs/test-plan/Test_Plan_TreasureRow.docx
@@ -23,7 +23,7 @@
           <w:i/>
           <w:sz w:val="28"/>
         </w:rPr>
-        <w:t>Test Plan — Iteration 2</w:t>
+        <w:t>Test Plan — Iteration 3</w:t>
       </w:r>
     </w:p>
     <w:p/>
@@ -52,13 +52,6 @@
             <w:sz w:val="24"/>
           </w:rPr>
           <w:t>1.0 Introduction</w:t>
-        </w:r>
-        <w:r>
-          <w:rPr>
-            <w:rFonts w:ascii="Times New Roman" w:hAnsi="Times New Roman"/>
-            <w:b/>
-            <w:sz w:val="24"/>
-          </w:rPr>
           <w:tab/>
           <w:t>2</w:t>
         </w:r>
@@ -80,13 +73,6 @@
             <w:sz w:val="24"/>
           </w:rPr>
           <w:t>2.0 Test Environment</w:t>
-        </w:r>
-        <w:r>
-          <w:rPr>
-            <w:rFonts w:ascii="Times New Roman" w:hAnsi="Times New Roman"/>
-            <w:b/>
-            <w:sz w:val="24"/>
-          </w:rPr>
           <w:tab/>
           <w:t>2</w:t>
         </w:r>
@@ -108,13 +94,6 @@
             <w:sz w:val="24"/>
           </w:rPr>
           <w:t>3.0 Regression Test Cases</w:t>
-        </w:r>
-        <w:r>
-          <w:rPr>
-            <w:rFonts w:ascii="Times New Roman" w:hAnsi="Times New Roman"/>
-            <w:b/>
-            <w:sz w:val="24"/>
-          </w:rPr>
           <w:tab/>
           <w:t>2</w:t>
         </w:r>
@@ -136,15 +115,50 @@
             <w:sz w:val="24"/>
           </w:rPr>
           <w:t>4.0 New Test Cases — Iteration 2 Fixes</w:t>
+          <w:tab/>
+          <w:t>3</w:t>
         </w:r>
+      </w:hyperlink>
+    </w:p>
+    <w:p>
+      <w:pPr>
+        <w:tabs>
+          <w:tab w:pos="9216" w:val="right" w:leader="dot"/>
+        </w:tabs>
+        <w:spacing w:after="80"/>
+        <w:ind w:left="0"/>
+      </w:pPr>
+      <w:hyperlink w:anchor="toc_6">
         <w:r>
           <w:rPr>
             <w:rFonts w:ascii="Times New Roman" w:hAnsi="Times New Roman"/>
             <w:b/>
             <w:sz w:val="24"/>
           </w:rPr>
+          <w:t>5.0 New Test Cases — Iteration 3 Fixes</w:t>
           <w:tab/>
-          <w:t>3</w:t>
+          <w:t>4</w:t>
+        </w:r>
+      </w:hyperlink>
+    </w:p>
+    <w:p>
+      <w:pPr>
+        <w:tabs>
+          <w:tab w:pos="9216" w:val="right" w:leader="dot"/>
+        </w:tabs>
+        <w:spacing w:after="80"/>
+        <w:ind w:left="0"/>
+      </w:pPr>
+      <w:hyperlink w:anchor="toc_7">
+        <w:r>
+          <w:rPr>
+            <w:rFonts w:ascii="Times New Roman" w:hAnsi="Times New Roman"/>
+            <w:b/>
+            <w:sz w:val="24"/>
+          </w:rPr>
+          <w:t>6.0 Automated Test Suite</w:t>
+          <w:tab/>
+          <w:t>6</w:t>
         </w:r>
       </w:hyperlink>
     </w:p>
@@ -163,16 +177,9 @@
             <w:b/>
             <w:sz w:val="24"/>
           </w:rPr>
-          <w:t>5.0 Revision Log</w:t>
-        </w:r>
-        <w:r>
-          <w:rPr>
-            <w:rFonts w:ascii="Times New Roman" w:hAnsi="Times New Roman"/>
-            <w:b/>
-            <w:sz w:val="24"/>
-          </w:rPr>
+          <w:t>7.0 Revision Log</w:t>
           <w:tab/>
-          <w:t>3</w:t>
+          <w:t>6</w:t>
         </w:r>
       </w:hyperlink>
     </w:p>
@@ -193,7 +200,7 @@
     </w:p>
     <w:p>
       <w:r>
-        <w:t>This Test Plan covers Iteration 2 testing for The Vault. It has two parts: regression tests confirming the core flows verified in Iteration 1 still work, and new test cases covering the fixes going into this iteration — the account ownership bug, image upload failures, dead navigation links, and the removal of hardcoded credentials. Test cases for any additional features will be added once those features are decided and scoped.</w:t>
+        <w:t>This Test Plan covers testing for Treasure Row through Iteration 3. It has four parts: regression tests confirming the core flows still work, the Iteration 2 fix cases (with corrected results after the Iteration 3 retest), new test cases for the fixes made in Iteration 3, and the automated test suite that now verifies them. Each Iteration 3 case names the automated test that proves it, so results are re-checkable rather than only reported.</w:t>
       </w:r>
     </w:p>
     <w:p>
@@ -208,7 +215,7 @@
     </w:p>
     <w:p>
       <w:r>
-        <w:t>Each tester runs a local copy of The Vault: Python 3.12+, a local PostgreSQL database (schema built via backend/init_db.py), and a .env file with local database settings. Testing is done against this local environment, not the original AWS deployment.</w:t>
+        <w:t>Each tester runs a local copy of Treasure Row: Python 3.12+, PostgreSQL, and a .env file (see .env.example). Manual testing uses the team's AWS RDS database and S3 bucket. Automated tests run against a separate local test database (treasurerow_test, configured in .env.test) so they never write test data into the team's AWS database; backend/tests/conftest.py refuses to run if DB_HOST is an AWS address, and uploads made by tests are saved locally instead of to S3.</w:t>
       </w:r>
     </w:p>
     <w:p>
@@ -1033,7 +1040,7 @@
           </w:tcPr>
           <w:p>
             <w:r>
-              <w:t>Pass</w:t>
+              <w:t>Re-tested — see TC-21</w:t>
             </w:r>
           </w:p>
         </w:tc>
@@ -1085,7 +1092,7 @@
           </w:tcPr>
           <w:p>
             <w:r>
-              <w:t>Pass</w:t>
+              <w:t>Failed on Iter. 3 retest; fixed — TC-20</w:t>
             </w:r>
           </w:p>
         </w:tc>
@@ -1137,7 +1144,7 @@
           </w:tcPr>
           <w:p>
             <w:r>
-              <w:t>Pass</w:t>
+              <w:t>Pass — re-verified on AWS S3 (10/26)</w:t>
             </w:r>
           </w:p>
         </w:tc>
@@ -1404,12 +1411,1212 @@
       </w:tr>
     </w:tbl>
     <w:p>
+      <w:r>
+        <w:t xml:space="preserve">Correction (Iteration 3): TC-12 and TC-13 were marked Pass in Iteration 2, but the Iteration 2 fix only changed the browser code. Retesting found the API still trusted X-User-Id / X-User-Role request headers sent by the client, so a signed-in user could edit or delete another user's storefronts and listings by setting those headers. The server now takes identity only from the login session; TC-20 and TC-21 cover it with automated tests that fail on the Iteration 2 code and pass on the fix.</w:t>
+      </w:r>
+    </w:p>
+    <w:p>
+      <w:bookmarkStart w:id="6" w:name="toc_6"/>
+      <w:pPr>
+        <w:pStyle w:val="Heading1"/>
+      </w:pPr>
+      <w:r>
+        <w:t>5.0 New Test Cases — Iteration 3 Fixes</w:t>
+      </w:r>
+      <w:bookmarkEnd w:id="6"/>
+    </w:p>
+    <w:p>
+      <w:r>
+        <w:t xml:space="preserve">Verifies the fixes made in Iteration 3. Each automated case was confirmed to fail on the previous code before the fix was applied.</w:t>
+      </w:r>
+    </w:p>
+    <w:tbl>
+      <w:tblPr>
+        <w:tblStyle w:val="TableGrid"/>
+        <w:tblW w:type="auto" w:w="0"/>
+        <w:jc w:val="center"/>
+        <w:tblLook w:firstColumn="1" w:firstRow="1" w:lastColumn="0" w:lastRow="0" w:noHBand="0" w:noVBand="1" w:val="04A0"/>
+      </w:tblPr>
+      <w:tblGrid>
+        <w:gridCol w:w="936"/>
+        <w:gridCol w:w="1512"/>
+        <w:gridCol w:w="3168"/>
+        <w:gridCol w:w="2592"/>
+        <w:gridCol w:w="1008"/>
+      </w:tblGrid>
+      <w:tr>
+        <w:tc>
+          <w:tcPr>
+            <w:tcW w:type="dxa" w:w="936"/>
+            <w:shd w:val="clear" w:fill="D9E2F3"/>
+          </w:tcPr>
+          <w:p>
+            <w:r>
+              <w:rPr>
+                <w:b/>
+              </w:rPr>
+              <w:t xml:space="preserve">ID</w:t>
+            </w:r>
+          </w:p>
+        </w:tc>
+        <w:tc>
+          <w:tcPr>
+            <w:tcW w:type="dxa" w:w="1512"/>
+            <w:shd w:val="clear" w:fill="D9E2F3"/>
+          </w:tcPr>
+          <w:p>
+            <w:r>
+              <w:rPr>
+                <w:b/>
+              </w:rPr>
+              <w:t xml:space="preserve">Area</w:t>
+            </w:r>
+          </w:p>
+        </w:tc>
+        <w:tc>
+          <w:tcPr>
+            <w:tcW w:type="dxa" w:w="3168"/>
+            <w:shd w:val="clear" w:fill="D9E2F3"/>
+          </w:tcPr>
+          <w:p>
+            <w:r>
+              <w:rPr>
+                <w:b/>
+              </w:rPr>
+              <w:t xml:space="preserve">Steps</w:t>
+            </w:r>
+          </w:p>
+        </w:tc>
+        <w:tc>
+          <w:tcPr>
+            <w:tcW w:type="dxa" w:w="2592"/>
+            <w:shd w:val="clear" w:fill="D9E2F3"/>
+          </w:tcPr>
+          <w:p>
+            <w:r>
+              <w:rPr>
+                <w:b/>
+              </w:rPr>
+              <w:t xml:space="preserve">Expected Result</w:t>
+            </w:r>
+          </w:p>
+        </w:tc>
+        <w:tc>
+          <w:tcPr>
+            <w:tcW w:type="dxa" w:w="1008"/>
+            <w:shd w:val="clear" w:fill="D9E2F3"/>
+          </w:tcPr>
+          <w:p>
+            <w:r>
+              <w:rPr>
+                <w:b/>
+              </w:rPr>
+              <w:t xml:space="preserve">Status</w:t>
+            </w:r>
+          </w:p>
+        </w:tc>
+      </w:tr>
+      <w:tr>
+        <w:tc>
+          <w:tcPr>
+            <w:tcW w:type="dxa" w:w="936"/>
+          </w:tcPr>
+          <w:p>
+            <w:r>
+              <w:t xml:space="preserve">TC-20</w:t>
+            </w:r>
+          </w:p>
+        </w:tc>
+        <w:tc>
+          <w:tcPr>
+            <w:tcW w:type="dxa" w:w="1512"/>
+          </w:tcPr>
+          <w:p>
+            <w:r>
+              <w:t xml:space="preserve">Ownership (API)</w:t>
+            </w:r>
+          </w:p>
+        </w:tc>
+        <w:tc>
+          <w:tcPr>
+            <w:tcW w:type="dxa" w:w="3168"/>
+          </w:tcPr>
+          <w:p>
+            <w:r>
+              <w:t xml:space="preserve">Signed in as user B, send edit/delete/deactivate requests for user A's listing and storefront, including spoofed X-User-Id / X-User-Role: admin headers</w:t>
+            </w:r>
+          </w:p>
+        </w:tc>
+        <w:tc>
+          <w:tcPr>
+            <w:tcW w:type="dxa" w:w="2592"/>
+          </w:tcPr>
+          <w:p>
+            <w:r>
+              <w:t xml:space="preserve">403 every time; A's data unchanged (test_ownership.py)</w:t>
+            </w:r>
+          </w:p>
+        </w:tc>
+        <w:tc>
+          <w:tcPr>
+            <w:tcW w:type="dxa" w:w="1008"/>
+          </w:tcPr>
+          <w:p>
+            <w:r>
+              <w:t xml:space="preserve">Pass</w:t>
+            </w:r>
+          </w:p>
+        </w:tc>
+      </w:tr>
+      <w:tr>
+        <w:tc>
+          <w:tcPr>
+            <w:tcW w:type="dxa" w:w="936"/>
+          </w:tcPr>
+          <w:p>
+            <w:r>
+              <w:t xml:space="preserve">TC-21</w:t>
+            </w:r>
+          </w:p>
+        </w:tc>
+        <w:tc>
+          <w:tcPr>
+            <w:tcW w:type="dxa" w:w="1512"/>
+          </w:tcPr>
+          <w:p>
+            <w:r>
+              <w:t xml:space="preserve">Ownership (account switching)</w:t>
+            </w:r>
+          </w:p>
+        </w:tc>
+        <w:tc>
+          <w:tcPr>
+            <w:tcW w:type="dxa" w:w="3168"/>
+          </w:tcPr>
+          <w:p>
+            <w:r>
+              <w:t xml:space="preserve">Sign in as A, then as B in the same browser via the login form; B tries to edit A's listing</w:t>
+            </w:r>
+          </w:p>
+        </w:tc>
+        <w:tc>
+          <w:tcPr>
+            <w:tcW w:type="dxa" w:w="2592"/>
+          </w:tcPr>
+          <w:p>
+            <w:r>
+              <w:t xml:space="preserve">Current user reported as B; edit blocked with 403 (test_ownership.py)</w:t>
+            </w:r>
+          </w:p>
+        </w:tc>
+        <w:tc>
+          <w:tcPr>
+            <w:tcW w:type="dxa" w:w="1008"/>
+          </w:tcPr>
+          <w:p>
+            <w:r>
+              <w:t xml:space="preserve">Pass</w:t>
+            </w:r>
+          </w:p>
+        </w:tc>
+      </w:tr>
+      <w:tr>
+        <w:tc>
+          <w:tcPr>
+            <w:tcW w:type="dxa" w:w="936"/>
+          </w:tcPr>
+          <w:p>
+            <w:r>
+              <w:t xml:space="preserve">TC-22</w:t>
+            </w:r>
+          </w:p>
+        </w:tc>
+        <w:tc>
+          <w:tcPr>
+            <w:tcW w:type="dxa" w:w="1512"/>
+          </w:tcPr>
+          <w:p>
+            <w:r>
+              <w:t xml:space="preserve">Sign-in required</w:t>
+            </w:r>
+          </w:p>
+        </w:tc>
+        <w:tc>
+          <w:tcPr>
+            <w:tcW w:type="dxa" w:w="3168"/>
+          </w:tcPr>
+          <w:p>
+            <w:r>
+              <w:t xml:space="preserve">Open any page or API while signed out</w:t>
+            </w:r>
+          </w:p>
+        </w:tc>
+        <w:tc>
+          <w:tcPr>
+            <w:tcW w:type="dxa" w:w="2592"/>
+          </w:tcPr>
+          <w:p>
+            <w:r>
+              <w:t xml:space="preserve">Pages redirect to Sign In; API calls return 401; only landing, sign-in, sign-up, admin sign-in are public (test_ownership.py, test_admin.py)</w:t>
+            </w:r>
+          </w:p>
+        </w:tc>
+        <w:tc>
+          <w:tcPr>
+            <w:tcW w:type="dxa" w:w="1008"/>
+          </w:tcPr>
+          <w:p>
+            <w:r>
+              <w:t xml:space="preserve">Pass</w:t>
+            </w:r>
+          </w:p>
+        </w:tc>
+      </w:tr>
+      <w:tr>
+        <w:tc>
+          <w:tcPr>
+            <w:tcW w:type="dxa" w:w="936"/>
+          </w:tcPr>
+          <w:p>
+            <w:r>
+              <w:t xml:space="preserve">TC-23</w:t>
+            </w:r>
+          </w:p>
+        </w:tc>
+        <w:tc>
+          <w:tcPr>
+            <w:tcW w:type="dxa" w:w="1512"/>
+          </w:tcPr>
+          <w:p>
+            <w:r>
+              <w:t xml:space="preserve">Cart pricing</w:t>
+            </w:r>
+          </w:p>
+        </w:tc>
+        <w:tc>
+          <w:tcPr>
+            <w:tcW w:type="dxa" w:w="3168"/>
+          </w:tcPr>
+          <w:p>
+            <w:r>
+              <w:t xml:space="preserve">Add an item while sending a fake price (0.01) and name in the form</w:t>
+            </w:r>
+          </w:p>
+        </w:tc>
+        <w:tc>
+          <w:tcPr>
+            <w:tcW w:type="dxa" w:w="2592"/>
+          </w:tcPr>
+          <w:p>
+            <w:r>
+              <w:t xml:space="preserve">Cart uses the listing's real price and title from the database (test_cart_pricing.py)</w:t>
+            </w:r>
+          </w:p>
+        </w:tc>
+        <w:tc>
+          <w:tcPr>
+            <w:tcW w:type="dxa" w:w="1008"/>
+          </w:tcPr>
+          <w:p>
+            <w:r>
+              <w:t xml:space="preserve">Pass</w:t>
+            </w:r>
+          </w:p>
+        </w:tc>
+      </w:tr>
+      <w:tr>
+        <w:tc>
+          <w:tcPr>
+            <w:tcW w:type="dxa" w:w="936"/>
+          </w:tcPr>
+          <w:p>
+            <w:r>
+              <w:t xml:space="preserve">TC-24</w:t>
+            </w:r>
+          </w:p>
+        </w:tc>
+        <w:tc>
+          <w:tcPr>
+            <w:tcW w:type="dxa" w:w="1512"/>
+          </w:tcPr>
+          <w:p>
+            <w:r>
+              <w:t xml:space="preserve">Cart validation</w:t>
+            </w:r>
+          </w:p>
+        </w:tc>
+        <w:tc>
+          <w:tcPr>
+            <w:tcW w:type="dxa" w:w="3168"/>
+          </w:tcPr>
+          <w:p>
+            <w:r>
+              <w:t xml:space="preserve">Add with quantity -3, 0, abc, 1.5, above stock; add a deleted, inactive, sold-out or unknown listing</w:t>
+            </w:r>
+          </w:p>
+        </w:tc>
+        <w:tc>
+          <w:tcPr>
+            <w:tcW w:type="dxa" w:w="2592"/>
+          </w:tcPr>
+          <w:p>
+            <w:r>
+              <w:t xml:space="preserve">Rejected with 400/404/409; nothing added (test_cart_pricing.py)</w:t>
+            </w:r>
+          </w:p>
+        </w:tc>
+        <w:tc>
+          <w:tcPr>
+            <w:tcW w:type="dxa" w:w="1008"/>
+          </w:tcPr>
+          <w:p>
+            <w:r>
+              <w:t xml:space="preserve">Pass</w:t>
+            </w:r>
+          </w:p>
+        </w:tc>
+      </w:tr>
+      <w:tr>
+        <w:tc>
+          <w:tcPr>
+            <w:tcW w:type="dxa" w:w="936"/>
+          </w:tcPr>
+          <w:p>
+            <w:r>
+              <w:t xml:space="preserve">TC-25</w:t>
+            </w:r>
+          </w:p>
+        </w:tc>
+        <w:tc>
+          <w:tcPr>
+            <w:tcW w:type="dxa" w:w="1512"/>
+          </w:tcPr>
+          <w:p>
+            <w:r>
+              <w:t xml:space="preserve">Checkout pricing</w:t>
+            </w:r>
+          </w:p>
+        </w:tc>
+        <w:tc>
+          <w:tcPr>
+            <w:tcW w:type="dxa" w:w="3168"/>
+          </w:tcPr>
+          <w:p>
+            <w:r>
+              <w:t xml:space="preserve">Check out a cart holding a tampered price; check out an item with no listing</w:t>
+            </w:r>
+          </w:p>
+        </w:tc>
+        <w:tc>
+          <w:tcPr>
+            <w:tcW w:type="dxa" w:w="2592"/>
+          </w:tcPr>
+          <w:p>
+            <w:r>
+              <w:t xml:space="preserve">Total charged from database price; invalid item rejected (test_cart_pricing.py)</w:t>
+            </w:r>
+          </w:p>
+        </w:tc>
+        <w:tc>
+          <w:tcPr>
+            <w:tcW w:type="dxa" w:w="1008"/>
+          </w:tcPr>
+          <w:p>
+            <w:r>
+              <w:t xml:space="preserve">Pass</w:t>
+            </w:r>
+          </w:p>
+        </w:tc>
+      </w:tr>
+      <w:tr>
+        <w:tc>
+          <w:tcPr>
+            <w:tcW w:type="dxa" w:w="936"/>
+          </w:tcPr>
+          <w:p>
+            <w:r>
+              <w:t xml:space="preserve">TC-26</w:t>
+            </w:r>
+          </w:p>
+        </w:tc>
+        <w:tc>
+          <w:tcPr>
+            <w:tcW w:type="dxa" w:w="1512"/>
+          </w:tcPr>
+          <w:p>
+            <w:r>
+              <w:t xml:space="preserve">Stored XSS</w:t>
+            </w:r>
+          </w:p>
+        </w:tc>
+        <w:tc>
+          <w:tcPr>
+            <w:tcW w:type="dxa" w:w="3168"/>
+          </w:tcPr>
+          <w:p>
+            <w:r>
+              <w:t xml:space="preserve">Create a storefront, listing and return whose name/title/description/reason contain &lt;img src=x onerror=...&gt;; open storefronts, storefront view, My Storefront, account and admin dashboard</w:t>
+            </w:r>
+          </w:p>
+        </w:tc>
+        <w:tc>
+          <w:tcPr>
+            <w:tcW w:type="dxa" w:w="2592"/>
+          </w:tcPr>
+          <w:p>
+            <w:r>
+              <w:t xml:space="preserve">Text shown literally; script never runs (headless Chrome check; failed on old code)</w:t>
+            </w:r>
+          </w:p>
+        </w:tc>
+        <w:tc>
+          <w:tcPr>
+            <w:tcW w:type="dxa" w:w="1008"/>
+          </w:tcPr>
+          <w:p>
+            <w:r>
+              <w:t xml:space="preserve">Pass</w:t>
+            </w:r>
+          </w:p>
+        </w:tc>
+      </w:tr>
+      <w:tr>
+        <w:tc>
+          <w:tcPr>
+            <w:tcW w:type="dxa" w:w="936"/>
+          </w:tcPr>
+          <w:p>
+            <w:r>
+              <w:t xml:space="preserve">TC-27</w:t>
+            </w:r>
+          </w:p>
+        </w:tc>
+        <w:tc>
+          <w:tcPr>
+            <w:tcW w:type="dxa" w:w="1512"/>
+          </w:tcPr>
+          <w:p>
+            <w:r>
+              <w:t xml:space="preserve">Upload folder</w:t>
+            </w:r>
+          </w:p>
+        </w:tc>
+        <w:tc>
+          <w:tcPr>
+            <w:tcW w:type="dxa" w:w="3168"/>
+          </w:tcPr>
+          <w:p>
+            <w:r>
+              <w:t xml:space="preserve">Upload a storefront image with folder ../../templates, /etc and other values</w:t>
+            </w:r>
+          </w:p>
+        </w:tc>
+        <w:tc>
+          <w:tcPr>
+            <w:tcW w:type="dxa" w:w="2592"/>
+          </w:tcPr>
+          <w:p>
+            <w:r>
+              <w:t xml:space="preserve">Rejected with 400; no file written outside static/uploads (test_uploads.py)</w:t>
+            </w:r>
+          </w:p>
+        </w:tc>
+        <w:tc>
+          <w:tcPr>
+            <w:tcW w:type="dxa" w:w="1008"/>
+          </w:tcPr>
+          <w:p>
+            <w:r>
+              <w:t xml:space="preserve">Pass</w:t>
+            </w:r>
+          </w:p>
+        </w:tc>
+      </w:tr>
+      <w:tr>
+        <w:tc>
+          <w:tcPr>
+            <w:tcW w:type="dxa" w:w="936"/>
+          </w:tcPr>
+          <w:p>
+            <w:r>
+              <w:t xml:space="preserve">TC-28</w:t>
+            </w:r>
+          </w:p>
+        </w:tc>
+        <w:tc>
+          <w:tcPr>
+            <w:tcW w:type="dxa" w:w="1512"/>
+          </w:tcPr>
+          <w:p>
+            <w:r>
+              <w:t xml:space="preserve">Upload content/size</w:t>
+            </w:r>
+          </w:p>
+        </w:tc>
+        <w:tc>
+          <w:tcPr>
+            <w:tcW w:type="dxa" w:w="3168"/>
+          </w:tcPr>
+          <w:p>
+            <w:r>
+              <w:t xml:space="preserve">Upload an HTML file renamed .png, an SVG, a non-image .jpg, a 5 MB+ image, a 25 MB+ request; same for listing and return photos</w:t>
+            </w:r>
+          </w:p>
+        </w:tc>
+        <w:tc>
+          <w:tcPr>
+            <w:tcW w:type="dxa" w:w="2592"/>
+          </w:tcPr>
+          <w:p>
+            <w:r>
+              <w:t xml:space="preserve">Non-images and oversize images 400; oversize request 413; real images saved with server-set type (test_uploads.py)</w:t>
+            </w:r>
+          </w:p>
+        </w:tc>
+        <w:tc>
+          <w:tcPr>
+            <w:tcW w:type="dxa" w:w="1008"/>
+          </w:tcPr>
+          <w:p>
+            <w:r>
+              <w:t xml:space="preserve">Pass</w:t>
+            </w:r>
+          </w:p>
+        </w:tc>
+      </w:tr>
+      <w:tr>
+        <w:tc>
+          <w:tcPr>
+            <w:tcW w:type="dxa" w:w="936"/>
+          </w:tcPr>
+          <w:p>
+            <w:r>
+              <w:t xml:space="preserve">TC-29</w:t>
+            </w:r>
+          </w:p>
+        </w:tc>
+        <w:tc>
+          <w:tcPr>
+            <w:tcW w:type="dxa" w:w="1512"/>
+          </w:tcPr>
+          <w:p>
+            <w:r>
+              <w:t xml:space="preserve">CSRF</w:t>
+            </w:r>
+          </w:p>
+        </w:tc>
+        <w:tc>
+          <w:tcPr>
+            <w:tcW w:type="dxa" w:w="3168"/>
+          </w:tcPr>
+          <w:p>
+            <w:r>
+              <w:t xml:space="preserve">Sign in and inspect the session cookie; send POST/DELETE with an Origin header from another site</w:t>
+            </w:r>
+          </w:p>
+        </w:tc>
+        <w:tc>
+          <w:tcPr>
+            <w:tcW w:type="dxa" w:w="2592"/>
+          </w:tcPr>
+          <w:p>
+            <w:r>
+              <w:t xml:space="preserve">Cookie is SameSite=Lax and HttpOnly; cross-site writes refused with 403; same-site still works (test_hardening.py)</w:t>
+            </w:r>
+          </w:p>
+        </w:tc>
+        <w:tc>
+          <w:tcPr>
+            <w:tcW w:type="dxa" w:w="1008"/>
+          </w:tcPr>
+          <w:p>
+            <w:r>
+              <w:t xml:space="preserve">Pass</w:t>
+            </w:r>
+          </w:p>
+        </w:tc>
+      </w:tr>
+      <w:tr>
+        <w:tc>
+          <w:tcPr>
+            <w:tcW w:type="dxa" w:w="936"/>
+          </w:tcPr>
+          <w:p>
+            <w:r>
+              <w:t xml:space="preserve">TC-30</w:t>
+            </w:r>
+          </w:p>
+        </w:tc>
+        <w:tc>
+          <w:tcPr>
+            <w:tcW w:type="dxa" w:w="1512"/>
+          </w:tcPr>
+          <w:p>
+            <w:r>
+              <w:t xml:space="preserve">Returns</w:t>
+            </w:r>
+          </w:p>
+        </w:tc>
+        <w:tc>
+          <w:tcPr>
+            <w:tcW w:type="dxa" w:w="3168"/>
+          </w:tcPr>
+          <w:p>
+            <w:r>
+              <w:t xml:space="preserve">File a return for your own order, someone else's order, and a made-up order number</w:t>
+            </w:r>
+          </w:p>
+        </w:tc>
+        <w:tc>
+          <w:tcPr>
+            <w:tcW w:type="dxa" w:w="2592"/>
+          </w:tcPr>
+          <w:p>
+            <w:r>
+              <w:t xml:space="preserve">Own order accepted; others rejected (test_hardening.py)</w:t>
+            </w:r>
+          </w:p>
+        </w:tc>
+        <w:tc>
+          <w:tcPr>
+            <w:tcW w:type="dxa" w:w="1008"/>
+          </w:tcPr>
+          <w:p>
+            <w:r>
+              <w:t xml:space="preserve">Pass</w:t>
+            </w:r>
+          </w:p>
+        </w:tc>
+      </w:tr>
+      <w:tr>
+        <w:tc>
+          <w:tcPr>
+            <w:tcW w:type="dxa" w:w="936"/>
+          </w:tcPr>
+          <w:p>
+            <w:r>
+              <w:t xml:space="preserve">TC-31</w:t>
+            </w:r>
+          </w:p>
+        </w:tc>
+        <w:tc>
+          <w:tcPr>
+            <w:tcW w:type="dxa" w:w="1512"/>
+          </w:tcPr>
+          <w:p>
+            <w:r>
+              <w:t xml:space="preserve">Configuration</w:t>
+            </w:r>
+          </w:p>
+        </w:tc>
+        <w:tc>
+          <w:tcPr>
+            <w:tcW w:type="dxa" w:w="3168"/>
+          </w:tcPr>
+          <w:p>
+            <w:r>
+              <w:t xml:space="preserve">Start the app without SECRET_KEY; open /auth/debug/session; sign in while the database is unreachable</w:t>
+            </w:r>
+          </w:p>
+        </w:tc>
+        <w:tc>
+          <w:tcPr>
+            <w:tcW w:type="dxa" w:w="2592"/>
+          </w:tcPr>
+          <w:p>
+            <w:r>
+              <w:t xml:space="preserve">App refuses to start; debug page 404; sign-in shows an error within 5 seconds (test_hardening.py + manual)</w:t>
+            </w:r>
+          </w:p>
+        </w:tc>
+        <w:tc>
+          <w:tcPr>
+            <w:tcW w:type="dxa" w:w="1008"/>
+          </w:tcPr>
+          <w:p>
+            <w:r>
+              <w:t xml:space="preserve">Pass</w:t>
+            </w:r>
+          </w:p>
+        </w:tc>
+      </w:tr>
+      <w:tr>
+        <w:tc>
+          <w:tcPr>
+            <w:tcW w:type="dxa" w:w="936"/>
+          </w:tcPr>
+          <w:p>
+            <w:r>
+              <w:t xml:space="preserve">TC-32</w:t>
+            </w:r>
+          </w:p>
+        </w:tc>
+        <w:tc>
+          <w:tcPr>
+            <w:tcW w:type="dxa" w:w="1512"/>
+          </w:tcPr>
+          <w:p>
+            <w:r>
+              <w:t xml:space="preserve">Sign-in errors</w:t>
+            </w:r>
+          </w:p>
+        </w:tc>
+        <w:tc>
+          <w:tcPr>
+            <w:tcW w:type="dxa" w:w="3168"/>
+          </w:tcPr>
+          <w:p>
+            <w:r>
+              <w:t xml:space="preserve">Sign in with a wrong password; bad admin credentials</w:t>
+            </w:r>
+          </w:p>
+        </w:tc>
+        <w:tc>
+          <w:tcPr>
+            <w:tcW w:type="dxa" w:w="2592"/>
+          </w:tcPr>
+          <w:p>
+            <w:r>
+              <w:t xml:space="preserve">Error shown on the form, username kept (manual, 10/26)</w:t>
+            </w:r>
+          </w:p>
+        </w:tc>
+        <w:tc>
+          <w:tcPr>
+            <w:tcW w:type="dxa" w:w="1008"/>
+          </w:tcPr>
+          <w:p>
+            <w:r>
+              <w:t xml:space="preserve">Pass</w:t>
+            </w:r>
+          </w:p>
+        </w:tc>
+      </w:tr>
+      <w:tr>
+        <w:tc>
+          <w:tcPr>
+            <w:tcW w:type="dxa" w:w="936"/>
+          </w:tcPr>
+          <w:p>
+            <w:r>
+              <w:t xml:space="preserve">TC-33</w:t>
+            </w:r>
+          </w:p>
+        </w:tc>
+        <w:tc>
+          <w:tcPr>
+            <w:tcW w:type="dxa" w:w="1512"/>
+          </w:tcPr>
+          <w:p>
+            <w:r>
+              <w:t xml:space="preserve">Registration</w:t>
+            </w:r>
+          </w:p>
+        </w:tc>
+        <w:tc>
+          <w:tcPr>
+            <w:tcW w:type="dxa" w:w="3168"/>
+          </w:tcPr>
+          <w:p>
+            <w:r>
+              <w:t xml:space="preserve">Register with @my.hamptonu.edu, @fakehamptonu.edu and @gmail.com; register a duplicate username</w:t>
+            </w:r>
+          </w:p>
+        </w:tc>
+        <w:tc>
+          <w:tcPr>
+            <w:tcW w:type="dxa" w:w="2592"/>
+          </w:tcPr>
+          <w:p>
+            <w:r>
+              <w:t xml:space="preserve">Only real Hampton domains accepted; password stored hashed; duplicate rejected (test_user.py)</w:t>
+            </w:r>
+          </w:p>
+        </w:tc>
+        <w:tc>
+          <w:tcPr>
+            <w:tcW w:type="dxa" w:w="1008"/>
+          </w:tcPr>
+          <w:p>
+            <w:r>
+              <w:t xml:space="preserve">Pass</w:t>
+            </w:r>
+          </w:p>
+        </w:tc>
+      </w:tr>
+    </w:tbl>
+    <w:p>
+      <w:bookmarkStart w:id="7" w:name="toc_7"/>
+      <w:pPr>
+        <w:pStyle w:val="Heading1"/>
+      </w:pPr>
+      <w:r>
+        <w:t>6.0 Automated Test Suite</w:t>
+      </w:r>
+      <w:bookmarkEnd w:id="7"/>
+    </w:p>
+    <w:p>
+      <w:r>
+        <w:t xml:space="preserve">Run from app/app with: python3 -m pytest backend/tests (one-time setup: createdb treasurerow_test and copy .env.test.example to .env.test).</w:t>
+      </w:r>
+    </w:p>
+    <w:p>
+      <w:r>
+        <w:t xml:space="preserve">Result on October 26, 2026: 74 tests passed, 0 failed, 0 skipped, on two consecutive runs, with no test rows left in the test database.</w:t>
+      </w:r>
+    </w:p>
+    <w:tbl>
+      <w:tblPr>
+        <w:tblStyle w:val="TableGrid"/>
+        <w:tblW w:type="auto" w:w="0"/>
+        <w:jc w:val="center"/>
+        <w:tblLook w:firstColumn="1" w:firstRow="1" w:lastColumn="0" w:lastRow="0" w:noHBand="0" w:noVBand="1" w:val="04A0"/>
+      </w:tblPr>
+      <w:tblGrid>
+        <w:gridCol w:w="3168"/>
+        <w:gridCol w:w="864"/>
+        <w:gridCol w:w="4608"/>
+      </w:tblGrid>
+      <w:tr>
+        <w:tc>
+          <w:tcPr>
+            <w:tcW w:type="dxa" w:w="3168"/>
+            <w:shd w:val="clear" w:fill="D9E2F3"/>
+          </w:tcPr>
+          <w:p>
+            <w:r>
+              <w:rPr>
+                <w:b/>
+              </w:rPr>
+              <w:t xml:space="preserve">Test file</w:t>
+            </w:r>
+          </w:p>
+        </w:tc>
+        <w:tc>
+          <w:tcPr>
+            <w:tcW w:type="dxa" w:w="864"/>
+            <w:shd w:val="clear" w:fill="D9E2F3"/>
+          </w:tcPr>
+          <w:p>
+            <w:r>
+              <w:rPr>
+                <w:b/>
+              </w:rPr>
+              <w:t xml:space="preserve">Tests</w:t>
+            </w:r>
+          </w:p>
+        </w:tc>
+        <w:tc>
+          <w:tcPr>
+            <w:tcW w:type="dxa" w:w="4608"/>
+            <w:shd w:val="clear" w:fill="D9E2F3"/>
+          </w:tcPr>
+          <w:p>
+            <w:r>
+              <w:rPr>
+                <w:b/>
+              </w:rPr>
+              <w:t xml:space="preserve">Covers</w:t>
+            </w:r>
+          </w:p>
+        </w:tc>
+      </w:tr>
+      <w:tr>
+        <w:tc>
+          <w:tcPr>
+            <w:tcW w:type="dxa" w:w="3168"/>
+          </w:tcPr>
+          <w:p>
+            <w:r>
+              <w:t xml:space="preserve">test_ownership.py</w:t>
+            </w:r>
+          </w:p>
+        </w:tc>
+        <w:tc>
+          <w:tcPr>
+            <w:tcW w:type="dxa" w:w="864"/>
+          </w:tcPr>
+          <w:p>
+            <w:r>
+              <w:t xml:space="preserve">13</w:t>
+            </w:r>
+          </w:p>
+        </w:tc>
+        <w:tc>
+          <w:tcPr>
+            <w:tcW w:type="dxa" w:w="4608"/>
+          </w:tcPr>
+          <w:p>
+            <w:r>
+              <w:t xml:space="preserve">Ownership bug: signed-out access, other users, spoofed headers, account switching, logout, admin</w:t>
+            </w:r>
+          </w:p>
+        </w:tc>
+      </w:tr>
+      <w:tr>
+        <w:tc>
+          <w:tcPr>
+            <w:tcW w:type="dxa" w:w="3168"/>
+          </w:tcPr>
+          <w:p>
+            <w:r>
+              <w:t xml:space="preserve">test_cart_pricing.py</w:t>
+            </w:r>
+          </w:p>
+        </w:tc>
+        <w:tc>
+          <w:tcPr>
+            <w:tcW w:type="dxa" w:w="864"/>
+          </w:tcPr>
+          <w:p>
+            <w:r>
+              <w:t xml:space="preserve">12</w:t>
+            </w:r>
+          </w:p>
+        </w:tc>
+        <w:tc>
+          <w:tcPr>
+            <w:tcW w:type="dxa" w:w="4608"/>
+          </w:tcPr>
+          <w:p>
+            <w:r>
+              <w:t xml:space="preserve">Cart and checkout prices/quantities come from the database</w:t>
+            </w:r>
+          </w:p>
+        </w:tc>
+      </w:tr>
+      <w:tr>
+        <w:tc>
+          <w:tcPr>
+            <w:tcW w:type="dxa" w:w="3168"/>
+          </w:tcPr>
+          <w:p>
+            <w:r>
+              <w:t xml:space="preserve">test_uploads.py</w:t>
+            </w:r>
+          </w:p>
+        </w:tc>
+        <w:tc>
+          <w:tcPr>
+            <w:tcW w:type="dxa" w:w="864"/>
+          </w:tcPr>
+          <w:p>
+            <w:r>
+              <w:t xml:space="preserve">13</w:t>
+            </w:r>
+          </w:p>
+        </w:tc>
+        <w:tc>
+          <w:tcPr>
+            <w:tcW w:type="dxa" w:w="4608"/>
+          </w:tcPr>
+          <w:p>
+            <w:r>
+              <w:t xml:space="preserve">Upload folders, real image contents, size limits</w:t>
+            </w:r>
+          </w:p>
+        </w:tc>
+      </w:tr>
+      <w:tr>
+        <w:tc>
+          <w:tcPr>
+            <w:tcW w:type="dxa" w:w="3168"/>
+          </w:tcPr>
+          <w:p>
+            <w:r>
+              <w:t xml:space="preserve">test_hardening.py</w:t>
+            </w:r>
+          </w:p>
+        </w:tc>
+        <w:tc>
+          <w:tcPr>
+            <w:tcW w:type="dxa" w:w="864"/>
+          </w:tcPr>
+          <w:p>
+            <w:r>
+              <w:t xml:space="preserve">8</w:t>
+            </w:r>
+          </w:p>
+        </w:tc>
+        <w:tc>
+          <w:tcPr>
+            <w:tcW w:type="dxa" w:w="4608"/>
+          </w:tcPr>
+          <w:p>
+            <w:r>
+              <w:t xml:space="preserve">CSRF, returns ownership, required SECRET_KEY</w:t>
+            </w:r>
+          </w:p>
+        </w:tc>
+      </w:tr>
+      <w:tr>
+        <w:tc>
+          <w:tcPr>
+            <w:tcW w:type="dxa" w:w="3168"/>
+          </w:tcPr>
+          <w:p>
+            <w:r>
+              <w:t xml:space="preserve">test_checkout.py</w:t>
+            </w:r>
+          </w:p>
+        </w:tc>
+        <w:tc>
+          <w:tcPr>
+            <w:tcW w:type="dxa" w:w="864"/>
+          </w:tcPr>
+          <w:p>
+            <w:r>
+              <w:t xml:space="preserve">8</w:t>
+            </w:r>
+          </w:p>
+        </w:tc>
+        <w:tc>
+          <w:tcPr>
+            <w:tcW w:type="dxa" w:w="4608"/>
+          </w:tcPr>
+          <w:p>
+            <w:r>
+              <w:t xml:space="preserve">Checkout flow, buyer details, order privacy, stock limits</w:t>
+            </w:r>
+          </w:p>
+        </w:tc>
+      </w:tr>
+      <w:tr>
+        <w:tc>
+          <w:tcPr>
+            <w:tcW w:type="dxa" w:w="3168"/>
+          </w:tcPr>
+          <w:p>
+            <w:r>
+              <w:t xml:space="preserve">test_admin.py</w:t>
+            </w:r>
+          </w:p>
+        </w:tc>
+        <w:tc>
+          <w:tcPr>
+            <w:tcW w:type="dxa" w:w="864"/>
+          </w:tcPr>
+          <w:p>
+            <w:r>
+              <w:t xml:space="preserve">9</w:t>
+            </w:r>
+          </w:p>
+        </w:tc>
+        <w:tc>
+          <w:tcPr>
+            <w:tcW w:type="dxa" w:w="4608"/>
+          </w:tcPr>
+          <w:p>
+            <w:r>
+              <w:t xml:space="preserve">Admin access control and admin API</w:t>
+            </w:r>
+          </w:p>
+        </w:tc>
+      </w:tr>
+      <w:tr>
+        <w:tc>
+          <w:tcPr>
+            <w:tcW w:type="dxa" w:w="3168"/>
+          </w:tcPr>
+          <w:p>
+            <w:r>
+              <w:t xml:space="preserve">test_user.py</w:t>
+            </w:r>
+          </w:p>
+        </w:tc>
+        <w:tc>
+          <w:tcPr>
+            <w:tcW w:type="dxa" w:w="864"/>
+          </w:tcPr>
+          <w:p>
+            <w:r>
+              <w:t xml:space="preserve">6</w:t>
+            </w:r>
+          </w:p>
+        </w:tc>
+        <w:tc>
+          <w:tcPr>
+            <w:tcW w:type="dxa" w:w="4608"/>
+          </w:tcPr>
+          <w:p>
+            <w:r>
+              <w:t xml:space="preserve">Registration and login rules</w:t>
+            </w:r>
+          </w:p>
+        </w:tc>
+      </w:tr>
+      <w:tr>
+        <w:tc>
+          <w:tcPr>
+            <w:tcW w:type="dxa" w:w="3168"/>
+          </w:tcPr>
+          <w:p>
+            <w:r>
+              <w:t xml:space="preserve">test_create_listing_feature.py</w:t>
+            </w:r>
+          </w:p>
+        </w:tc>
+        <w:tc>
+          <w:tcPr>
+            <w:tcW w:type="dxa" w:w="864"/>
+          </w:tcPr>
+          <w:p>
+            <w:r>
+              <w:t xml:space="preserve">3</w:t>
+            </w:r>
+          </w:p>
+        </w:tc>
+        <w:tc>
+          <w:tcPr>
+            <w:tcW w:type="dxa" w:w="4608"/>
+          </w:tcPr>
+          <w:p>
+            <w:r>
+              <w:t xml:space="preserve">Listing creation</w:t>
+            </w:r>
+          </w:p>
+        </w:tc>
+      </w:tr>
+      <w:tr>
+        <w:tc>
+          <w:tcPr>
+            <w:tcW w:type="dxa" w:w="3168"/>
+          </w:tcPr>
+          <w:p>
+            <w:r>
+              <w:t xml:space="preserve">test_wishlist_feature.py</w:t>
+            </w:r>
+          </w:p>
+        </w:tc>
+        <w:tc>
+          <w:tcPr>
+            <w:tcW w:type="dxa" w:w="864"/>
+          </w:tcPr>
+          <w:p>
+            <w:r>
+              <w:t xml:space="preserve">2</w:t>
+            </w:r>
+          </w:p>
+        </w:tc>
+        <w:tc>
+          <w:tcPr>
+            <w:tcW w:type="dxa" w:w="4608"/>
+          </w:tcPr>
+          <w:p>
+            <w:r>
+              <w:t xml:space="preserve">Wishlist add/check/remove</w:t>
+            </w:r>
+          </w:p>
+        </w:tc>
+      </w:tr>
+    </w:tbl>
+    <w:p>
       <w:bookmarkStart w:id="5" w:name="toc_5"/>
       <w:pPr>
         <w:pStyle w:val="Heading1"/>
       </w:pPr>
       <w:r>
-        <w:t>5.0 Revision Log</w:t>
+        <w:t>7.0 Revision Log</w:t>
       </w:r>
       <w:bookmarkEnd w:id="5"/>
     </w:p>
@@ -1497,6 +2704,38 @@
           <w:p>
             <w:r>
               <w:t>Initial Iteration 2 Test Plan drafted — regression cases plus new cases for this iteration's fixes.</w:t>
+            </w:r>
+          </w:p>
+        </w:tc>
+      </w:tr>
+      <w:tr>
+        <w:tc>
+          <w:tcPr>
+            <w:tcW w:type="dxa" w:w="1440"/>
+          </w:tcPr>
+          <w:p>
+            <w:r>
+              <w:t>3</w:t>
+            </w:r>
+          </w:p>
+        </w:tc>
+        <w:tc>
+          <w:tcPr>
+            <w:tcW w:type="dxa" w:w="2448"/>
+          </w:tcPr>
+          <w:p>
+            <w:r>
+              <w:t>October 26, 2026</w:t>
+            </w:r>
+          </w:p>
+        </w:tc>
+        <w:tc>
+          <w:tcPr>
+            <w:tcW w:type="dxa" w:w="6048"/>
+          </w:tcPr>
+          <w:p>
+            <w:r>
+              <w:t xml:space="preserve">Updated for Iteration 3: corrected TC-12/TC-13 after retest, re-verified TC-14 on S3, added TC-20 to TC-33 for the Iteration 3 security and reliability fixes, and added the automated test suite (74 passing).</w:t>
             </w:r>
           </w:p>
         </w:tc>

</xml_diff>

<commit_message>
Test Plan: name the Iteration 3 feature areas (Treasure Tokens, messaging, Discover pages) in the intro and section 5.0
Co-Authored-By: Claude Opus 5.5 <noreply@anthropic.com>
</commit_message>
<xml_diff>
--- a/docs/test-plan/Test_Plan_TreasureRow.docx
+++ b/docs/test-plan/Test_Plan_TreasureRow.docx
@@ -135,7 +135,7 @@
             <w:b/>
             <w:sz w:val="24"/>
           </w:rPr>
-          <w:t>5.0 New Test Cases — Iteration 3 Fixes</w:t>
+          <w:t>5.0 New Test Cases — Iteration 3 Fixes and Features</w:t>
           <w:tab/>
           <w:t>4</w:t>
         </w:r>
@@ -200,7 +200,7 @@
     </w:p>
     <w:p>
       <w:r>
-        <w:t>This Test Plan covers testing for Treasure Row through Iteration 3. It has four parts: regression tests confirming the core flows still work, the Iteration 2 fix cases (with corrected results after the Iteration 3 retest), new test cases for the fixes made in Iteration 3, and the automated test suite that now verifies them. Each Iteration 3 case names the automated test that proves it, so results are re-checkable rather than only reported.</w:t>
+        <w:t>This Test Plan covers testing for Treasure Row through Iteration 3. It has four parts: regression tests confirming the core flows still work, the Iteration 2 fix cases (with corrected results after the Iteration 3 retest), new test cases for Iteration 3, and the automated test suite that now verifies them. The Iteration 3 cases cover the security and reliability fixes (TC-20 to TC-33), the Treasure Tokens payment system (TC-34 to TC-41), the SCRUM-61 security hardening (TC-42 to TC-46), buyer/seller messaging (TC-47 to TC-48), the Discover pages (TC-49 to TC-50), and the live AWS deployment (TC-51). Each Iteration 3 case names the automated test that proves it, so results are re-checkable rather than only reported.</w:t>
       </w:r>
     </w:p>
     <w:p>
@@ -1421,13 +1421,13 @@
         <w:pStyle w:val="Heading1"/>
       </w:pPr>
       <w:r>
-        <w:t>5.0 New Test Cases — Iteration 3 Fixes</w:t>
+        <w:t>5.0 New Test Cases — Iteration 3 Fixes and Features</w:t>
       </w:r>
       <w:bookmarkEnd w:id="6"/>
     </w:p>
     <w:p>
       <w:r>
-        <w:t xml:space="preserve">Verifies the fixes made in Iteration 3. Each automated case was confirmed to fail on the previous code before the fix was applied.</w:t>
+        <w:t xml:space="preserve">Verifies the Iteration 3 fixes and new features: security and reliability fixes (TC-20 to TC-33), Treasure Tokens (TC-34 to TC-41), SCRUM-61 hardening (TC-42 to TC-46), messaging (TC-47 to TC-48), Discover pages (TC-49 to TC-50), and the live deployment (TC-51). Each automated fix case was confirmed to fail on the previous code before the fix was applied.</w:t>
       </w:r>
     </w:p>
     <w:tbl>

</xml_diff>